<commit_message>
added full report screen, telegram links and light refinement
</commit_message>
<xml_diff>
--- a/assets/report_template.docx
+++ b/assets/report_template.docx
@@ -98,6 +98,7 @@
                 <w:r>
                   <w:rPr>
                     <w:rStyle w:val="PlaceholderText"/>
+                    <w:color w:val="auto"/>
                   </w:rPr>
                   <w:t>Click or tap here to enter text.</w:t>
                 </w:r>
@@ -190,6 +191,7 @@
                 <w:r>
                   <w:rPr>
                     <w:rStyle w:val="PlaceholderText"/>
+                    <w:color w:val="auto"/>
                   </w:rPr>
                   <w:t>Click or tap here to enter text.</w:t>
                 </w:r>
@@ -257,6 +259,7 @@
                 <w:r>
                   <w:rPr>
                     <w:rStyle w:val="PlaceholderText"/>
+                    <w:color w:val="auto"/>
                   </w:rPr>
                   <w:t>Click or tap here to enter text.</w:t>
                 </w:r>
@@ -321,6 +324,7 @@
                 <w:r>
                   <w:rPr>
                     <w:rStyle w:val="PlaceholderText"/>
+                    <w:color w:val="auto"/>
                   </w:rPr>
                   <w:t>Click or tap here to enter text.</w:t>
                 </w:r>
@@ -474,6 +478,7 @@
                 <w:r>
                   <w:rPr>
                     <w:rStyle w:val="PlaceholderText"/>
+                    <w:color w:val="auto"/>
                   </w:rPr>
                   <w:t>Click or tap here to enter text.</w:t>
                 </w:r>
@@ -625,6 +630,7 @@
                 <w:r>
                   <w:rPr>
                     <w:rStyle w:val="PlaceholderText"/>
+                    <w:color w:val="auto"/>
                   </w:rPr>
                   <w:t>Click or tap here to enter text.</w:t>
                 </w:r>
@@ -664,6 +670,7 @@
                 <w:r>
                   <w:rPr>
                     <w:rStyle w:val="PlaceholderText"/>
+                    <w:color w:val="auto"/>
                   </w:rPr>
                   <w:t>Click or tap here to enter text.</w:t>
                 </w:r>
@@ -703,6 +710,7 @@
                 <w:r>
                   <w:rPr>
                     <w:rStyle w:val="PlaceholderText"/>
+                    <w:color w:val="auto"/>
                   </w:rPr>
                   <w:t>Click or tap here to enter text.</w:t>
                 </w:r>
@@ -744,6 +752,7 @@
                 <w:r>
                   <w:rPr>
                     <w:rStyle w:val="PlaceholderText"/>
+                    <w:color w:val="auto"/>
                   </w:rPr>
                   <w:t>Click or tap here to enter text.</w:t>
                 </w:r>
@@ -783,6 +792,7 @@
                 <w:r>
                   <w:rPr>
                     <w:rStyle w:val="PlaceholderText"/>
+                    <w:color w:val="auto"/>
                   </w:rPr>
                   <w:t>Click or tap here to enter text.</w:t>
                 </w:r>
@@ -825,6 +835,7 @@
                 <w:r>
                   <w:rPr>
                     <w:rStyle w:val="PlaceholderText"/>
+                    <w:color w:val="auto"/>
                   </w:rPr>
                   <w:t>Click or tap here to enter text.</w:t>
                 </w:r>
@@ -1043,6 +1054,7 @@
                 <w:r>
                   <w:rPr>
                     <w:rStyle w:val="PlaceholderText"/>
+                    <w:color w:val="auto"/>
                   </w:rPr>
                   <w:t>Click or tap here to enter text.</w:t>
                 </w:r>
@@ -1082,6 +1094,7 @@
                 <w:r>
                   <w:rPr>
                     <w:rStyle w:val="PlaceholderText"/>
+                    <w:color w:val="auto"/>
                   </w:rPr>
                   <w:t>Click or tap here to enter text.</w:t>
                 </w:r>
@@ -1238,6 +1251,7 @@
                 <w:r>
                   <w:rPr>
                     <w:rStyle w:val="PlaceholderText"/>
+                    <w:color w:val="auto"/>
                   </w:rPr>
                   <w:t>Click or tap here to enter text.</w:t>
                 </w:r>
@@ -2400,9 +2414,11 @@
   </w:compat>
   <w:rsids>
     <w:rsidRoot w:val="00D668DA"/>
+    <w:rsid w:val="0019529E"/>
     <w:rsid w:val="005A06F1"/>
     <w:rsid w:val="005C259F"/>
     <w:rsid w:val="00605210"/>
+    <w:rsid w:val="007D07D1"/>
     <w:rsid w:val="00827E0D"/>
     <w:rsid w:val="00BA200F"/>
     <w:rsid w:val="00D668DA"/>

</xml_diff>